<commit_message>
Align project documentation with final implementation
</commit_message>
<xml_diff>
--- a/docs/实际报告/最终版/07231533冯峥嵘.docx
+++ b/docs/实际报告/最终版/07231533冯峥嵘.docx
@@ -2066,7 +2066,7 @@
           <w:i w:val="0"/>
           <w:sz w:val="21"/>
         </w:rPr>
-        <w:t>应急调度模块需要展现最优的路径规划。当调度员在列表中选择一个待派单的受灾点（工单）时，系统自动锁定该工单的 WGS84 坐标，并向本地部署的 OSRM 发起网络路径请求。OSRM 引擎结合江苏 OSM 道路网，快速计算出最近的空闲泵车并返回行驶道路的折线几何以及预计时间和行驶距离。</w:t>
+        <w:t>应急调度模块需要展现最优的路径规划。当调度员在列表中选择一个待派单的受灾点（工单）时，系统自动锁定该工单的 WGS84 坐标，并向本地部署的 OSRM 发起网络路径请求。前端先从空闲泵车中筛选候选资源，再请求 OSRM 结合江苏 OSM 道路网计算实际行驶路线，返回道路折线几何、预计时间和行驶距离。</w:t>
       </w:r>
       <w:r/>
     </w:p>
@@ -2084,7 +2084,7 @@
           <w:i w:val="0"/>
           <w:sz w:val="21"/>
         </w:rPr>
-        <w:t>前端将 Polyline 解码为 GeoJSON 折线要素，加载至地图中。为了提升人机交互质感，我利用 MapLibre 的 Layer 机制和定时偏移参数（dasharray offset），在道路折线上渲染了一组顺着行驶方向流动的箭头，作为行驶路径的流光动画。同时，调度台整合了资源和工单的状态机联动，每次状态转换（派单 -&gt; PROCESSING, 抵达 -&gt; ARRIVED, 完成 -&gt; COMPLETED）均通过数据库事务加锁保证并发一致，并通过 WebSocket 广播刷新。</w:t>
+        <w:t>前端将 Polyline 解码为 GeoJSON 折线要素，加载至地图中。为了提升人机交互质感，我利用 MapLibre 的 Layer 机制和定时更新的点要素，在道路折线上渲染顺着行驶方向移动的流光粒子，形成直观的路线动画。同时，调度台整合了资源和工单的状态机联动，每次状态转换（派单 -&gt; PROCESSING, 抵达 -&gt; ARRIVED, 完成 -&gt; COMPLETED）均通过数据库事务加锁保证并发一致，并通过 WebSocket 广播刷新。</w:t>
       </w:r>
       <w:r/>
     </w:p>
@@ -2138,7 +2138,7 @@
           <w:i w:val="0"/>
           <w:sz w:val="21"/>
         </w:rPr>
-        <w:t xml:space="preserve">为了防止大尺寸照片堵塞局域网带宽或撑爆服务器存储，我在浏览器端编写了图片压缩逻辑：在图片载入后，使用 Canvas 判定其长边，若超过 1920 像素则进行等比等宽缩放，并降低质量导出为 Base64 追加上传，压缩后的大小基本控制在 500KB 以内，提升了移动上报的流畅度。提交成功后仅保存追踪码，公众可跨设备查询处理状态。</w:t>
+        <w:t>为了防止大尺寸照片堵塞局域网带宽或撑爆服务器存储，我在浏览器端编写了图片压缩逻辑：在图片载入后，使用 Canvas 判定其长边；若超过 1920 像素则进行等比缩放，并以压缩后的 JPEG/WebP 文件通过 Multipart 方式上传，从而显著降低移动网络带宽和服务器存储压力。提交成功后仅保存追踪码，公众可跨设备查询处理状态。</w:t>
       </w:r>
       <w:r/>
     </w:p>

</xml_diff>